<commit_message>
release: 发布 BrickCore CE v1.6.0
开源发行版 v1.6.0（建议执行器 BrickCoreRunner v1.6.1 / 引擎 1.6.1）。相对 v1.5.x，主要变更：

- Web 慢站：超时倍率、忙碌/就绪、动作后沉降与 reappear；步骤超时与倍率对齐
- 智能点击/输入、容错关键字（若存在/若可见）、指针拦截自愈
- Web 免登录：环境启动登录态注入；设置 LocalStorage/SessionStorage/Cookie/鉴权Token；导出登录态
- 交互调试：工具条结果同步与 toast、变量回显、页面冻结保留悬停（须 Runner 1.6.1）
- 执行记录：进度展示、批量删除与数据保留策略；实时画面页流
- 通知：手动发送报告勾选渠道；失败告警按 API/Web/压测/App 分项；邮件体积保护
- 接口/数据工厂：响应 Headers、时间工具实时取值、库断言调试体验
- 压测：分压文案澄清、CSV csv 列引用（须新执行器）
- 稳定性：Web 定时 misfire 容错；看板统计与鉴权查询加固，避免缺字段 500
- 资料库：通用模板与能力继续开放；定制文档页签预留（无行业定制包）
- 仓库清理：移除历史 core 扁平残留；执行器引擎源码仍不在本仓
- 同步更新交流群二维码（约至 8 月 23 日前有效）

升级：aerich upgrade + 重建前端；务必更新 BrickCoreRunner / BrickCorePerf 至 1.6.1。
</commit_message>
<xml_diff>
--- a/backend/static/knowledge/generic/通用功能测试报告模板.docx
+++ b/backend/static/knowledge/generic/通用功能测试报告模板.docx
@@ -48,7 +48,7 @@
           <w:color w:val="707070"/>
           <w:sz w:val="20"/>
         </w:rPr>
-        <w:t>BrickCore · 内置模板</w:t>
+        <w:t>BrickCore 知识智能 · 内置模板</w:t>
       </w:r>
     </w:p>
     <w:p>
@@ -857,31 +857,7 @@
           </w:tcPr>
           <w:p>
             <w:r>
-              <w:t>{%tr for row in bug_stats_rows %}</w:t>
-            </w:r>
-          </w:p>
-        </w:tc>
-        <w:tc>
-          <w:tcPr>
-            <w:tcW w:type="dxa" w:w="3173"/>
-          </w:tcPr>
-          <w:p/>
-        </w:tc>
-        <w:tc>
-          <w:tcPr>
-            <w:tcW w:type="dxa" w:w="3173"/>
-          </w:tcPr>
-          <w:p/>
-        </w:tc>
-      </w:tr>
-      <w:tr>
-        <w:tc>
-          <w:tcPr>
-            <w:tcW w:type="dxa" w:w="3173"/>
-          </w:tcPr>
-          <w:p>
-            <w:r>
-              <w:t>{{ row.dimension }}</w:t>
+              <w:t>{%tr for row in bug_stats_rows %}{{ row.dimension }}</w:t>
             </w:r>
           </w:p>
         </w:tc>

</xml_diff>